<commit_message>
i18n: remove all Russian text and ruble amounts from public-facing files
examples/ fixtures (requirements_wallet.docx, example_test_cases.xlsx,
README.md) are now fully English with USD amounts — this is the
international version of the repo, and the fixtures need to read cleanly
for a non-Russian reviewer without needing translation.

SKILL.md's description dropped the literal Cyrillic trigger phrases; the
skill still handles requests phrased in other languages, that behavior
just isn't spelled out with example Cyrillic text anymore. The 'Раздел ТЗ'
example column name in Phase 2 became 'Spec Section'.

test_design.md's ruble example amounts became dollar amounts.

Co-Authored-By: Claude Sonnet 5 <noreply@anthropic.com>
Claude-Session: https://claude.ai/code/session_01HYfZkPnWEHmFmb45hkqkyv
</commit_message>
<xml_diff>
--- a/examples/requirements_wallet.docx
+++ b/examples/requirements_wallet.docx
@@ -7,12 +7,12 @@
         <w:pStyle w:val="Title"/>
       </w:pPr>
       <w:r>
-        <w:t>Техническое задание: модуль «Кошелёк»</w:t>
+        <w:t>Requirements: Wallet module</w:t>
       </w:r>
     </w:p>
     <w:p>
       <w:r>
-        <w:t>Продукт: мобильное приложение и веб-кабинет FinPay. Версия документа 3.2 от 12.08.2026. Автор: продуктовая команда «Платежи».</w:t>
+        <w:t>Product: mobile app and web dashboard for FinPay. Document version 3.2, dated 2026-08-12. Author: Payments product team.</w:t>
       </w:r>
     </w:p>
     <w:p>
@@ -20,27 +20,27 @@
         <w:pStyle w:val="Heading1"/>
       </w:pPr>
       <w:r>
-        <w:t>1. Общие положения</w:t>
+        <w:t>1. General provisions</w:t>
       </w:r>
     </w:p>
     <w:p>
       <w:r>
-        <w:t>1.1. Кошелёк доступен авторизованным пользователям мобильного приложения (iOS, Android) и веб-кабинета.</w:t>
+        <w:t>1.1. The wallet is available to authenticated users of the mobile app (iOS, Android) and the web dashboard.</w:t>
       </w:r>
     </w:p>
     <w:p>
       <w:r>
-        <w:t>1.2. Валюта кошелька — рубль (RUB). Баланс отображается с точностью до копеек.</w:t>
+        <w:t>1.2. Wallet currency is US Dollar (USD). Balance is shown to the cent.</w:t>
       </w:r>
     </w:p>
     <w:p>
       <w:r>
-        <w:t>1.3. Операции с кошельком доступны только пользователю с подтверждённым статусом.</w:t>
+        <w:t>1.3. Wallet operations are available only to a user with verified status.</w:t>
       </w:r>
     </w:p>
     <w:p>
       <w:r>
-        <w:t>1.4. Заблокированный аккаунт видит баланс и историю, но не может проводить операции.</w:t>
+        <w:t>1.4. A blocked account can see its balance and history but cannot perform operations.</w:t>
       </w:r>
     </w:p>
     <w:p>
@@ -48,32 +48,32 @@
         <w:pStyle w:val="Heading1"/>
       </w:pPr>
       <w:r>
-        <w:t>2. Пополнение кошелька</w:t>
+        <w:t>2. Top-up</w:t>
       </w:r>
     </w:p>
     <w:p>
       <w:r>
-        <w:t>2.1. Минимальная сумма одного пополнения — 10 ₽, максимальная — 300 000 ₽. Сумма вводится целым числом рублей, дробная часть не принимается.</w:t>
+        <w:t>2.1. Minimum top-up amount is $10, maximum is $300,000. The amount is entered as a whole number of dollars; fractional amounts are not accepted.</w:t>
       </w:r>
     </w:p>
     <w:p>
       <w:r>
-        <w:t>2.2. Способы пополнения: банковская карта и СБП. Обработка идёт через внешнего платёжного провайдера.</w:t>
+        <w:t>2.2. Top-up methods: bank card and instant bank transfer. Processing goes through an external payment provider.</w:t>
       </w:r>
     </w:p>
     <w:p>
       <w:r>
-        <w:t>2.3. После успешного списания баланс увеличивается не позднее чем через 5 секунд, пользователю показывается уведомление «Кошелёк пополнен на N ₽».</w:t>
+        <w:t>2.3. After a successful charge, the balance increases within 5 seconds, and the user sees the notification “Wallet topped up by $N”.</w:t>
       </w:r>
     </w:p>
     <w:p>
       <w:r>
-        <w:t>2.4. При отклонении платежа банком показывается сообщение «Платёж отклонён банком», баланс не меняется.</w:t>
+        <w:t>2.4. If the bank declines the payment, the message “Payment declined by bank” is shown, and the balance does not change.</w:t>
       </w:r>
     </w:p>
     <w:p>
       <w:r>
-        <w:t>2.5. Суточный лимит пополнения — 500 000 ₽ суммарно по всем операциям.</w:t>
+        <w:t>2.5. Daily top-up limit is $500,000 across all operations.</w:t>
       </w:r>
     </w:p>
     <w:p>
@@ -81,42 +81,42 @@
         <w:pStyle w:val="Heading1"/>
       </w:pPr>
       <w:r>
-        <w:t>3. Вывод средств</w:t>
+        <w:t>3. Withdrawal</w:t>
       </w:r>
     </w:p>
     <w:p>
       <w:r>
-        <w:t>3.1. Вывод доступен только на банковскую карту, привязанную к аккаунту не менее 3 дней назад.</w:t>
+        <w:t>3.1. Withdrawal is only available to a bank card that has been linked to the account for at least 3 days.</w:t>
       </w:r>
     </w:p>
     <w:p>
       <w:r>
-        <w:t>3.2. Лимит одной операции вывода — 50 000 ₽. Суточный лимит вывода — 150 000 ₽.</w:t>
+        <w:t>3.2. The limit per withdrawal operation is $50,000. The daily withdrawal limit is $150,000.</w:t>
       </w:r>
     </w:p>
     <w:p>
       <w:r>
-        <w:t>3.3. С каждой операции вывода удерживается комиссия сервиса.</w:t>
+        <w:t>3.3. A service fee is withheld from every withdrawal operation.</w:t>
       </w:r>
     </w:p>
     <w:p>
       <w:r>
-        <w:t>3.4. Вывод подтверждается одноразовым кодом из SMS. Код действует 5 минут. Допускается 3 попытки ввода кода; после третьей неверной попытки вывод блокируется на 15 минут.</w:t>
+        <w:t>3.4. Withdrawal is confirmed with a one-time SMS code. The code is valid for 5 minutes. Up to 3 attempts to enter the code are allowed; after the third wrong attempt, withdrawal is locked for 15 minutes.</w:t>
       </w:r>
     </w:p>
     <w:p>
       <w:r>
-        <w:t>3.5. Вывод средств должен обрабатываться быстро.</w:t>
+        <w:t>3.5. Withdrawals should be processed quickly.</w:t>
       </w:r>
     </w:p>
     <w:p>
       <w:r>
-        <w:t>3.6. Нельзя вывести сумму, превышающую баланс за вычетом комиссии.</w:t>
+        <w:t>3.6. A user cannot withdraw an amount exceeding the balance minus the fee.</w:t>
       </w:r>
     </w:p>
     <w:p>
       <w:r>
-        <w:t>3.7. Пример сценария: пользователь с балансом 80 000 ₽ оформляет вывод на 75 000 ₽. Операция выполняется успешно, на карту приходит сумма за вычетом комиссии.</w:t>
+        <w:t>3.7. Example scenario: a user with a balance of $80,000 requests a withdrawal of $75,000. The operation completes successfully, and the card receives the amount minus the fee.</w:t>
       </w:r>
     </w:p>
     <w:p>
@@ -124,12 +124,12 @@
         <w:pStyle w:val="Heading1"/>
       </w:pPr>
       <w:r>
-        <w:t>4. Жизненный цикл операции</w:t>
+        <w:t>4. Operation lifecycle</w:t>
       </w:r>
     </w:p>
     <w:p>
       <w:r>
-        <w:t>4.1. Операция проходит статусы, описанные в таблице ниже.</w:t>
+        <w:t>4.1. An operation moves through the statuses described in the table below.</w:t>
       </w:r>
     </w:p>
     <w:tbl>
@@ -153,7 +153,7 @@
               <w:rPr>
                 <w:b/>
               </w:rPr>
-              <w:t>Статус</w:t>
+              <w:t>Status</w:t>
             </w:r>
           </w:p>
         </w:tc>
@@ -166,7 +166,7 @@
               <w:rPr>
                 <w:b/>
               </w:rPr>
-              <w:t>Из какого статуса доступен</w:t>
+              <w:t>Reachable from</w:t>
             </w:r>
           </w:p>
         </w:tc>
@@ -179,7 +179,7 @@
               <w:rPr>
                 <w:b/>
               </w:rPr>
-              <w:t>Комментарий</w:t>
+              <w:t>Comment</w:t>
             </w:r>
           </w:p>
         </w:tc>
@@ -211,7 +211,7 @@
           </w:tcPr>
           <w:p>
             <w:r>
-              <w:t>Операция создана, средства не списаны</w:t>
+              <w:t>Operation created, funds not yet debited</w:t>
             </w:r>
           </w:p>
         </w:tc>
@@ -243,7 +243,7 @@
           </w:tcPr>
           <w:p>
             <w:r>
-              <w:t>Запрос отправлен провайдеру</w:t>
+              <w:t>Request sent to the provider</w:t>
             </w:r>
           </w:p>
         </w:tc>
@@ -275,7 +275,7 @@
           </w:tcPr>
           <w:p>
             <w:r>
-              <w:t>Терминальный статус, средства переведены</w:t>
+              <w:t>Terminal status, funds transferred</w:t>
             </w:r>
           </w:p>
         </w:tc>
@@ -307,7 +307,7 @@
           </w:tcPr>
           <w:p>
             <w:r>
-              <w:t>Ошибка на стороне провайдера</w:t>
+              <w:t>Error on the provider's side</w:t>
             </w:r>
           </w:p>
         </w:tc>
@@ -339,7 +339,7 @@
           </w:tcPr>
           <w:p>
             <w:r>
-              <w:t>Отменена пользователем до отправки провайдеру</w:t>
+              <w:t>Cancelled by the user before it was sent to the provider</w:t>
             </w:r>
           </w:p>
         </w:tc>
@@ -347,12 +347,12 @@
     </w:tbl>
     <w:p>
       <w:r>
-        <w:t>4.2. Операция в статусе failed может быть повторена один раз — она возвращается в статус pending. Повторная неудача делает статус терминальным.</w:t>
+        <w:t>4.2. An operation in the failed status may be retried once — it returns to the pending status. A second failure makes the status terminal.</w:t>
       </w:r>
     </w:p>
     <w:p>
       <w:r>
-        <w:t>4.3. Операция в статусе completed не может быть отменена.</w:t>
+        <w:t>4.3. An operation in the completed status cannot be cancelled.</w:t>
       </w:r>
     </w:p>
     <w:p>
@@ -360,22 +360,22 @@
         <w:pStyle w:val="Heading1"/>
       </w:pPr>
       <w:r>
-        <w:t>5. История операций</w:t>
+        <w:t>5. Operation history</w:t>
       </w:r>
     </w:p>
     <w:p>
       <w:r>
-        <w:t>5.1. История показывает последние 100 операций, по 20 на страницу, сортировка по дате по убыванию.</w:t>
+        <w:t>5.1. History shows the last 100 operations, 20 per page, sorted by date descending.</w:t>
       </w:r>
     </w:p>
     <w:p>
       <w:r>
-        <w:t>5.2. Доступны фильтры по типу операции (пополнение / вывод) и по периоду.</w:t>
+        <w:t>5.2. Filters by operation type (top-up / withdrawal) and by period are available.</w:t>
       </w:r>
     </w:p>
     <w:p>
       <w:r>
-        <w:t>5.3. Новому пользователю без операций показывается заглушка «Операций пока нет».</w:t>
+        <w:t>5.3. A new user with no operations sees the placeholder “No operations yet”.</w:t>
       </w:r>
     </w:p>
     <w:p>
@@ -383,12 +383,12 @@
         <w:pStyle w:val="Heading1"/>
       </w:pPr>
       <w:r>
-        <w:t>6. Условия доступности вывода</w:t>
+        <w:t>6. Withdrawal availability conditions</w:t>
       </w:r>
     </w:p>
     <w:p>
       <w:r>
-        <w:t>6.1. Кнопка «Вывести» активна, если одновременно выполняются условия:</w:t>
+        <w:t>6.1. The “Withdraw” button is active when all of the following hold at the same time:</w:t>
       </w:r>
     </w:p>
     <w:p>
@@ -396,7 +396,7 @@
         <w:pStyle w:val="ListBullet"/>
       </w:pPr>
       <w:r>
-        <w:t>статус пользователя подтверждён;</w:t>
+        <w:t>user status is verified;</w:t>
       </w:r>
     </w:p>
     <w:p>
@@ -404,7 +404,7 @@
         <w:pStyle w:val="ListBullet"/>
       </w:pPr>
       <w:r>
-        <w:t>аккаунт не заблокирован;</w:t>
+        <w:t>the account is not blocked;</w:t>
       </w:r>
     </w:p>
     <w:p>
@@ -412,7 +412,7 @@
         <w:pStyle w:val="ListBullet"/>
       </w:pPr>
       <w:r>
-        <w:t>сумма вывода не превышает лимит одной операции;</w:t>
+        <w:t>the withdrawal amount does not exceed the per-operation limit;</w:t>
       </w:r>
     </w:p>
     <w:p>
@@ -420,7 +420,7 @@
         <w:pStyle w:val="ListBullet"/>
       </w:pPr>
       <w:r>
-        <w:t>баланс больше или равен сумме вывода плюс комиссия;</w:t>
+        <w:t>the balance is greater than or equal to the withdrawal amount plus the fee;</w:t>
       </w:r>
     </w:p>
     <w:p>
@@ -428,12 +428,12 @@
         <w:pStyle w:val="ListBullet"/>
       </w:pPr>
       <w:r>
-        <w:t>карта привязана не менее 3 дней назад.</w:t>
+        <w:t>the card has been linked for at least 3 days.</w:t>
       </w:r>
     </w:p>
     <w:p>
       <w:r>
-        <w:t>6.2. Если хотя бы одно условие не выполнено, кнопка неактивна, под ней показывается причина недоступности.</w:t>
+        <w:t>6.2. If at least one condition is not met, the button is inactive, and the reason for unavailability is shown below it.</w:t>
       </w:r>
     </w:p>
     <w:sectPr>

</xml_diff>